<commit_message>
Complete V3 runtime governance and submission artifacts
</commit_message>
<xml_diff>
--- a/deliverables/Corporate_Wallet_Digital_Twin_V3_System_Dossier.docx
+++ b/deliverables/Corporate_Wallet_Digital_Twin_V3_System_Dossier.docx
@@ -2643,7 +2643,7 @@
         <w:keepLines/>
       </w:pPr>
       <w:r>
-        <w:t xml:space="preserve">Seven entitled </w:t>
+        <w:t xml:space="preserve">Eight entitled </w:t>
       </w:r>
       <w:r>
         <w:rPr>
@@ -2654,7 +2654,18 @@
         <w:t>/v3</w:t>
       </w:r>
       <w:r>
-        <w:t xml:space="preserve"> routes and seven V3 JSON Schemas, bringing the exported contract catalogue to 22 schemas while preserving every </w:t>
+        <w:t xml:space="preserve"> routes, including the composed </w:t>
+      </w:r>
+      <w:r>
+        <w:rPr>
+          <w:rFonts w:ascii="Consolas" w:hAnsi="Consolas"/>
+          <w:color w:val="0B1F3A"/>
+          <w:sz w:val="19"/>
+        </w:rPr>
+        <w:t>/v3/decision-lab</w:t>
+      </w:r>
+      <w:r>
+        <w:t xml:space="preserve"> read model, and seven V3 JSON Schemas, bringing the exported contract catalogue to 22 schemas while preserving every </w:t>
       </w:r>
       <w:r>
         <w:rPr>
@@ -4268,7 +4279,7 @@
         <w:t>src/wallet_twin_v2</w:t>
       </w:r>
       <w:r>
-        <w:t xml:space="preserve"> remains the governed substrate for contracts, service composition, evidence governance, bounds, posterior wallet/share, economics, sensitivity, timing, experimentation, GenAI, entitlements, repositories, adapters and validation. V3 adds 12 focused modules under </w:t>
+        <w:t xml:space="preserve"> remains the governed substrate for contracts, evidence governance, bounds, posterior wallet/share, economics, sensitivity, timing, experimentation, GenAI, entitlements, repositories, adapters and validation. V3 adds 12 focused modules under </w:t>
       </w:r>
       <w:r>
         <w:rPr>
@@ -4279,7 +4290,7 @@
         <w:t>src/wallet_twin_v3</w:t>
       </w:r>
       <w:r>
-        <w:t xml:space="preserve"> for contracts, fixtures, repository composition, shadow-network reconstruction, PU learning, event dynamics, decision portfolio, VOI, treasury graphs, briefing and API integration. The dependency direction is V3 to V2; V2 has no dependency on V3.</w:t>
+        <w:t xml:space="preserve"> for contracts, fixtures, repository composition, shadow-network reconstruction, PU learning, event dynamics, decision portfolio, VOI, treasury graphs, briefing and API integration. The analytical dependency direction is V3 to V2; only the composed API/service assembly imports the V3 router so the recommendation and workbench-BFF deployments expose both versions.</w:t>
       </w:r>
     </w:p>
     <w:p>
@@ -6159,7 +6170,7 @@
                 <w:color w:val="263238"/>
                 <w:sz w:val="16"/>
               </w:rPr>
-              <w:t>legacy/</w:t>
+              <w:t>legacy/v1/</w:t>
             </w:r>
             <w:r>
               <w:rPr>
@@ -16356,7 +16367,18 @@
         <w:keepLines/>
       </w:pPr>
       <w:r>
-        <w:t xml:space="preserve">V3 exports a versioned OpenAPI contract and 15 JSON Schemas. Internal APIs require bank identity in controlled environments, enforce object-level authorization and require </w:t>
+        <w:t xml:space="preserve">V3 exports a composed V1/V3 OpenAPI contract and 22 JSON Schemas. Eight entitled </w:t>
+      </w:r>
+      <w:r>
+        <w:rPr>
+          <w:rFonts w:ascii="Consolas" w:hAnsi="Consolas"/>
+          <w:color w:val="0B1F3A"/>
+          <w:sz w:val="19"/>
+        </w:rPr>
+        <w:t>/v3</w:t>
+      </w:r>
+      <w:r>
+        <w:t xml:space="preserve"> routes cover the Decision Lab aggregate, opportunities, client latent network, leakage, action portfolio, evidence acquisition, decision brief and validation. Internal APIs require bank identity in controlled environments, enforce object-level authorization and require </w:t>
       </w:r>
       <w:r>
         <w:rPr>
@@ -16605,7 +16627,18 @@
         <w:keepLines/>
       </w:pPr>
       <w:r>
-        <w:t>Service-owned PostgreSQL schemas include evidence fact workflow, effective rate cards with exclusion constraints preventing overlapping validity windows, experiment assignment/outcome/pilot/outbox tables, recommendation interactions and entitlement access decisions. Cross-service SQL reads are prohibited. The transactional outbox supports reliable event publication.</w:t>
+        <w:t xml:space="preserve">Service-owned PostgreSQL schemas include evidence fact workflow, effective rate cards with exclusion constraints preventing overlapping validity windows, experiment assignment/outcome/pilot/outbox tables, recommendation interactions and entitlement access decisions. V3 adds versioned reconstruction runs, signal publications, portfolio selections, evidence-acquisition approvals and brief-compilation state under </w:t>
+      </w:r>
+      <w:r>
+        <w:rPr>
+          <w:rFonts w:ascii="Consolas" w:hAnsi="Consolas"/>
+          <w:color w:val="0B1F3A"/>
+          <w:sz w:val="19"/>
+        </w:rPr>
+        <w:t>decision_intelligence</w:t>
+      </w:r>
+      <w:r>
+        <w:t>. Cross-service SQL reads are prohibited. The transactional outbox supports reliable event publication.</w:t>
       </w:r>
     </w:p>
     <w:p>
@@ -16623,7 +16656,62 @@
         <w:keepLines/>
       </w:pPr>
       <w:r>
-        <w:t>Ten versioned domain topics carry eligibility, assignment, display, open, dismissal, action, milestone, outcome, evidence approval and access-decision events. Default production shape is 12 partitions, replication factor three, minimum in-sync replicas two and 365-day retention; the access-decision topic uses 24 partitions. Contract-quarantine and integration dead-letter topics retain failures for 90 days.</w:t>
+        <w:t xml:space="preserve">Fifteen versioned domain topics carry the ten V1/V2 events plus </w:t>
+      </w:r>
+      <w:r>
+        <w:rPr>
+          <w:rFonts w:ascii="Consolas" w:hAnsi="Consolas"/>
+          <w:color w:val="0B1F3A"/>
+          <w:sz w:val="19"/>
+        </w:rPr>
+        <w:t>ShadowWalletReconstructed</w:t>
+      </w:r>
+      <w:r>
+        <w:t xml:space="preserve">, </w:t>
+      </w:r>
+      <w:r>
+        <w:rPr>
+          <w:rFonts w:ascii="Consolas" w:hAnsi="Consolas"/>
+          <w:color w:val="0B1F3A"/>
+          <w:sz w:val="19"/>
+        </w:rPr>
+        <w:t>LeakageSignalPublished</w:t>
+      </w:r>
+      <w:r>
+        <w:t xml:space="preserve">, </w:t>
+      </w:r>
+      <w:r>
+        <w:rPr>
+          <w:rFonts w:ascii="Consolas" w:hAnsi="Consolas"/>
+          <w:color w:val="0B1F3A"/>
+          <w:sz w:val="19"/>
+        </w:rPr>
+        <w:t>ActionPortfolioSelected</w:t>
+      </w:r>
+      <w:r>
+        <w:t xml:space="preserve">, </w:t>
+      </w:r>
+      <w:r>
+        <w:rPr>
+          <w:rFonts w:ascii="Consolas" w:hAnsi="Consolas"/>
+          <w:color w:val="0B1F3A"/>
+          <w:sz w:val="19"/>
+        </w:rPr>
+        <w:t>EvidenceAcquisitionApproved</w:t>
+      </w:r>
+      <w:r>
+        <w:t xml:space="preserve"> and </w:t>
+      </w:r>
+      <w:r>
+        <w:rPr>
+          <w:rFonts w:ascii="Consolas" w:hAnsi="Consolas"/>
+          <w:color w:val="0B1F3A"/>
+          <w:sz w:val="19"/>
+        </w:rPr>
+        <w:t>DecisionBriefCompiled</w:t>
+      </w:r>
+      <w:r>
+        <w:t>. Default production shape is 12 partitions, replication factor three, minimum in-sync replicas two and 365-day retention; the access-decision topic uses 24 partitions. Contract-quarantine and integration dead-letter topics retain failures for 90 days.</w:t>
       </w:r>
     </w:p>
     <w:p>
@@ -16880,7 +16968,7 @@
         <w:keepLines/>
       </w:pPr>
       <w:r>
-        <w:t>The target creates raw, conformed, curated, features, training, monitoring, registry and governance schemas. Delta Change Data Feed and append-only properties are defined where appropriate for evidence facts, wallet snapshots, release-gate results, client-product activity, multibank calibration observations, effective rate cards, recommendation events and promotion decisions.</w:t>
+        <w:t>The target creates raw, conformed, curated, features, training, monitoring, registry and governance schemas. Delta Change Data Feed and append-only properties are defined where appropriate for evidence facts, wallet snapshots, release-gate results, client-product activity, multibank calibration observations, effective rate cards, recommendation events and promotion decisions. V3 definitions add Shadow Wallet draws and edges, PU product-need estimates, Bayesian change-point state, leakage alarms, Treasury graph snapshots, portfolio scenarios and selections, and evidence-acquisition plans. Client IDs and sensitive economics receive explicit governed tags.</w:t>
       </w:r>
     </w:p>
     <w:p>
@@ -16983,7 +17071,7 @@
         <w:t>rollback</w:t>
       </w:r>
       <w:r>
-        <w:t>. A candidate must include the model, environment lock, point-in-time dataset manifest, feature transformation, prior, diagnostics, validation report, model card, SBOM and signature.</w:t>
+        <w:t>. A candidate must include the model, environment lock, point-in-time dataset manifest, feature transformation, prior, diagnostics, validation report, model card, SBOM and signature. V3 additionally requires the Shadow Wallet transport manifest, PU selection-mechanism manifest, change-point hazard manifest, public-sensor snapshot, CVaR scenario policy, VOI policy and composed V3 validation report.</w:t>
       </w:r>
     </w:p>
     <w:p>
@@ -16991,7 +17079,7 @@
         <w:keepLines/>
       </w:pPr>
       <w:r>
-        <w:t>Candidate-to-shadow gates include independent reproduction, zero future leakage, overall 90% interval coverage between 85% and 95%, at least 10% CRPS improvement and no severe material-segment undercoverage. Shadow-to-champion additionally requires a representative E3 panel, approved economics, security and entitlement approval, 30 clean production-shadow days and model-risk approval. Promotion and rollback are human-authorized; no automatic model promotion is permitted.</w:t>
+        <w:t>Candidate-to-shadow gates include independent reproduction, zero future leakage, exact Shadow Wallet mass balance, registered transport marginals/costs/regularization, anonymous providers, registered PU selection/class prior, registered BOCPD hazard/baseline, a point-in-time public-sensor snapshot, seeded constraint-satisfying CVaR scenarios, positive-net-VOI with human approval, zero measured/causal mislabelling, overall 90% interval coverage between 85% and 95%, at least 10% CRPS improvement and no severe material-segment undercoverage. Shadow-to-champion additionally requires independent V3 transport/PU/change/portfolio/VOI validation, a representative E3 panel, approved economics, security and entitlement approval, 30 clean production-shadow days and model-risk approval. Promotion and rollback are human-authorized; no automatic model promotion is permitted.</w:t>
       </w:r>
     </w:p>
     <w:p>
@@ -17349,7 +17437,7 @@
         <w:keepLines/>
       </w:pPr>
       <w:r>
-        <w:t>70 backend tests across the V1 boundary, V2 substrate and V3 decision layer;</w:t>
+        <w:t>the complete backend suite across the V1 boundary, V2 substrate and V3 decision layer;</w:t>
       </w:r>
     </w:p>
     <w:p>
@@ -25759,9 +25847,9 @@
         <w:tblInd w:w="120" w:type="dxa"/>
       </w:tblPr>
       <w:tblGrid>
-        <w:gridCol w:w="2320"/>
-        <w:gridCol w:w="3473"/>
-        <w:gridCol w:w="3567"/>
+        <w:gridCol w:w="2400"/>
+        <w:gridCol w:w="3445"/>
+        <w:gridCol w:w="3515"/>
       </w:tblGrid>
       <w:tr>
         <w:trPr>
@@ -25769,7 +25857,7 @@
         </w:trPr>
         <w:tc>
           <w:tcPr>
-            <w:tcW w:type="dxa" w:w="2320"/>
+            <w:tcW w:type="dxa" w:w="2400"/>
             <w:vAlign w:val="center"/>
             <w:tcMar>
               <w:top w:w="80" w:type="dxa"/>
@@ -25796,7 +25884,7 @@
         </w:tc>
         <w:tc>
           <w:tcPr>
-            <w:tcW w:type="dxa" w:w="3473"/>
+            <w:tcW w:type="dxa" w:w="3445"/>
             <w:vAlign w:val="center"/>
             <w:tcMar>
               <w:top w:w="80" w:type="dxa"/>
@@ -25823,7 +25911,7 @@
         </w:tc>
         <w:tc>
           <w:tcPr>
-            <w:tcW w:type="dxa" w:w="3567"/>
+            <w:tcW w:type="dxa" w:w="3515"/>
             <w:vAlign w:val="center"/>
             <w:tcMar>
               <w:top w:w="80" w:type="dxa"/>
@@ -25852,7 +25940,7 @@
       <w:tr>
         <w:tc>
           <w:tcPr>
-            <w:tcW w:type="dxa" w:w="2320"/>
+            <w:tcW w:type="dxa" w:w="2400"/>
             <w:vAlign w:val="center"/>
             <w:tcMar>
               <w:top w:w="80" w:type="dxa"/>
@@ -25877,7 +25965,7 @@
         </w:tc>
         <w:tc>
           <w:tcPr>
-            <w:tcW w:type="dxa" w:w="3473"/>
+            <w:tcW w:type="dxa" w:w="3445"/>
             <w:vAlign w:val="center"/>
             <w:tcMar>
               <w:top w:w="80" w:type="dxa"/>
@@ -25902,7 +25990,7 @@
         </w:tc>
         <w:tc>
           <w:tcPr>
-            <w:tcW w:type="dxa" w:w="3567"/>
+            <w:tcW w:type="dxa" w:w="3515"/>
             <w:vAlign w:val="center"/>
             <w:tcMar>
               <w:top w:w="80" w:type="dxa"/>
@@ -25929,7 +26017,7 @@
       <w:tr>
         <w:tc>
           <w:tcPr>
-            <w:tcW w:type="dxa" w:w="2320"/>
+            <w:tcW w:type="dxa" w:w="2400"/>
             <w:vAlign w:val="center"/>
             <w:tcMar>
               <w:top w:w="80" w:type="dxa"/>
@@ -25954,7 +26042,7 @@
         </w:tc>
         <w:tc>
           <w:tcPr>
-            <w:tcW w:type="dxa" w:w="3473"/>
+            <w:tcW w:type="dxa" w:w="3445"/>
             <w:vAlign w:val="center"/>
             <w:tcMar>
               <w:top w:w="80" w:type="dxa"/>
@@ -25979,7 +26067,7 @@
         </w:tc>
         <w:tc>
           <w:tcPr>
-            <w:tcW w:type="dxa" w:w="3567"/>
+            <w:tcW w:type="dxa" w:w="3515"/>
             <w:vAlign w:val="center"/>
             <w:tcMar>
               <w:top w:w="80" w:type="dxa"/>
@@ -26006,7 +26094,7 @@
       <w:tr>
         <w:tc>
           <w:tcPr>
-            <w:tcW w:type="dxa" w:w="2320"/>
+            <w:tcW w:type="dxa" w:w="2400"/>
             <w:vAlign w:val="center"/>
             <w:tcMar>
               <w:top w:w="80" w:type="dxa"/>
@@ -26031,7 +26119,7 @@
         </w:tc>
         <w:tc>
           <w:tcPr>
-            <w:tcW w:type="dxa" w:w="3473"/>
+            <w:tcW w:type="dxa" w:w="3445"/>
             <w:vAlign w:val="center"/>
             <w:tcMar>
               <w:top w:w="80" w:type="dxa"/>
@@ -26056,7 +26144,7 @@
         </w:tc>
         <w:tc>
           <w:tcPr>
-            <w:tcW w:type="dxa" w:w="3567"/>
+            <w:tcW w:type="dxa" w:w="3515"/>
             <w:vAlign w:val="center"/>
             <w:tcMar>
               <w:top w:w="80" w:type="dxa"/>
@@ -26083,7 +26171,7 @@
       <w:tr>
         <w:tc>
           <w:tcPr>
-            <w:tcW w:type="dxa" w:w="2320"/>
+            <w:tcW w:type="dxa" w:w="2400"/>
             <w:vAlign w:val="center"/>
             <w:tcMar>
               <w:top w:w="80" w:type="dxa"/>
@@ -26108,7 +26196,7 @@
         </w:tc>
         <w:tc>
           <w:tcPr>
-            <w:tcW w:type="dxa" w:w="3473"/>
+            <w:tcW w:type="dxa" w:w="3445"/>
             <w:vAlign w:val="center"/>
             <w:tcMar>
               <w:top w:w="80" w:type="dxa"/>
@@ -26133,7 +26221,7 @@
         </w:tc>
         <w:tc>
           <w:tcPr>
-            <w:tcW w:type="dxa" w:w="3567"/>
+            <w:tcW w:type="dxa" w:w="3515"/>
             <w:vAlign w:val="center"/>
             <w:tcMar>
               <w:top w:w="80" w:type="dxa"/>
@@ -26160,7 +26248,7 @@
       <w:tr>
         <w:tc>
           <w:tcPr>
-            <w:tcW w:type="dxa" w:w="2320"/>
+            <w:tcW w:type="dxa" w:w="2400"/>
             <w:vAlign w:val="center"/>
             <w:tcMar>
               <w:top w:w="80" w:type="dxa"/>
@@ -26185,7 +26273,7 @@
         </w:tc>
         <w:tc>
           <w:tcPr>
-            <w:tcW w:type="dxa" w:w="3473"/>
+            <w:tcW w:type="dxa" w:w="3445"/>
             <w:vAlign w:val="center"/>
             <w:tcMar>
               <w:top w:w="80" w:type="dxa"/>
@@ -26210,7 +26298,7 @@
         </w:tc>
         <w:tc>
           <w:tcPr>
-            <w:tcW w:type="dxa" w:w="3567"/>
+            <w:tcW w:type="dxa" w:w="3515"/>
             <w:vAlign w:val="center"/>
             <w:tcMar>
               <w:top w:w="80" w:type="dxa"/>
@@ -26237,7 +26325,7 @@
       <w:tr>
         <w:tc>
           <w:tcPr>
-            <w:tcW w:type="dxa" w:w="2320"/>
+            <w:tcW w:type="dxa" w:w="2400"/>
             <w:vAlign w:val="center"/>
             <w:tcMar>
               <w:top w:w="80" w:type="dxa"/>
@@ -26262,7 +26350,7 @@
         </w:tc>
         <w:tc>
           <w:tcPr>
-            <w:tcW w:type="dxa" w:w="3473"/>
+            <w:tcW w:type="dxa" w:w="3445"/>
             <w:vAlign w:val="center"/>
             <w:tcMar>
               <w:top w:w="80" w:type="dxa"/>
@@ -26287,7 +26375,7 @@
         </w:tc>
         <w:tc>
           <w:tcPr>
-            <w:tcW w:type="dxa" w:w="3567"/>
+            <w:tcW w:type="dxa" w:w="3515"/>
             <w:vAlign w:val="center"/>
             <w:tcMar>
               <w:top w:w="80" w:type="dxa"/>
@@ -26314,7 +26402,7 @@
       <w:tr>
         <w:tc>
           <w:tcPr>
-            <w:tcW w:type="dxa" w:w="2320"/>
+            <w:tcW w:type="dxa" w:w="2400"/>
             <w:vAlign w:val="center"/>
             <w:tcMar>
               <w:top w:w="80" w:type="dxa"/>
@@ -26339,7 +26427,7 @@
         </w:tc>
         <w:tc>
           <w:tcPr>
-            <w:tcW w:type="dxa" w:w="3473"/>
+            <w:tcW w:type="dxa" w:w="3445"/>
             <w:vAlign w:val="center"/>
             <w:tcMar>
               <w:top w:w="80" w:type="dxa"/>
@@ -26364,7 +26452,7 @@
         </w:tc>
         <w:tc>
           <w:tcPr>
-            <w:tcW w:type="dxa" w:w="3567"/>
+            <w:tcW w:type="dxa" w:w="3515"/>
             <w:vAlign w:val="center"/>
             <w:tcMar>
               <w:top w:w="80" w:type="dxa"/>
@@ -26391,7 +26479,7 @@
       <w:tr>
         <w:tc>
           <w:tcPr>
-            <w:tcW w:type="dxa" w:w="2320"/>
+            <w:tcW w:type="dxa" w:w="2400"/>
             <w:vAlign w:val="center"/>
             <w:tcMar>
               <w:top w:w="80" w:type="dxa"/>
@@ -26416,7 +26504,7 @@
         </w:tc>
         <w:tc>
           <w:tcPr>
-            <w:tcW w:type="dxa" w:w="3473"/>
+            <w:tcW w:type="dxa" w:w="3445"/>
             <w:vAlign w:val="center"/>
             <w:tcMar>
               <w:top w:w="80" w:type="dxa"/>
@@ -26441,7 +26529,7 @@
         </w:tc>
         <w:tc>
           <w:tcPr>
-            <w:tcW w:type="dxa" w:w="3567"/>
+            <w:tcW w:type="dxa" w:w="3515"/>
             <w:vAlign w:val="center"/>
             <w:tcMar>
               <w:top w:w="80" w:type="dxa"/>
@@ -26468,7 +26556,7 @@
       <w:tr>
         <w:tc>
           <w:tcPr>
-            <w:tcW w:type="dxa" w:w="2320"/>
+            <w:tcW w:type="dxa" w:w="2400"/>
             <w:vAlign w:val="center"/>
             <w:tcMar>
               <w:top w:w="80" w:type="dxa"/>
@@ -26493,7 +26581,7 @@
         </w:tc>
         <w:tc>
           <w:tcPr>
-            <w:tcW w:type="dxa" w:w="3473"/>
+            <w:tcW w:type="dxa" w:w="3445"/>
             <w:vAlign w:val="center"/>
             <w:tcMar>
               <w:top w:w="80" w:type="dxa"/>
@@ -26518,7 +26606,7 @@
         </w:tc>
         <w:tc>
           <w:tcPr>
-            <w:tcW w:type="dxa" w:w="3567"/>
+            <w:tcW w:type="dxa" w:w="3515"/>
             <w:vAlign w:val="center"/>
             <w:tcMar>
               <w:top w:w="80" w:type="dxa"/>
@@ -26545,7 +26633,7 @@
       <w:tr>
         <w:tc>
           <w:tcPr>
-            <w:tcW w:type="dxa" w:w="2320"/>
+            <w:tcW w:type="dxa" w:w="2400"/>
             <w:vAlign w:val="center"/>
             <w:tcMar>
               <w:top w:w="80" w:type="dxa"/>
@@ -26570,7 +26658,7 @@
         </w:tc>
         <w:tc>
           <w:tcPr>
-            <w:tcW w:type="dxa" w:w="3473"/>
+            <w:tcW w:type="dxa" w:w="3445"/>
             <w:vAlign w:val="center"/>
             <w:tcMar>
               <w:top w:w="80" w:type="dxa"/>
@@ -26595,7 +26683,7 @@
         </w:tc>
         <w:tc>
           <w:tcPr>
-            <w:tcW w:type="dxa" w:w="3567"/>
+            <w:tcW w:type="dxa" w:w="3515"/>
             <w:vAlign w:val="center"/>
             <w:tcMar>
               <w:top w:w="80" w:type="dxa"/>
@@ -26615,6 +26703,391 @@
                 <w:sz w:val="17"/>
               </w:rPr>
               <w:t>Immutable entitlement evidence and anomaly monitoring</w:t>
+            </w:r>
+          </w:p>
+        </w:tc>
+      </w:tr>
+      <w:tr>
+        <w:tc>
+          <w:tcPr>
+            <w:tcW w:type="dxa" w:w="2400"/>
+            <w:vAlign w:val="center"/>
+            <w:tcMar>
+              <w:top w:w="80" w:type="dxa"/>
+              <w:start w:w="120" w:type="dxa"/>
+              <w:bottom w:w="80" w:type="dxa"/>
+              <w:end w:w="120" w:type="dxa"/>
+            </w:tcMar>
+          </w:tcPr>
+          <w:p>
+            <w:pPr>
+              <w:spacing w:after="0" w:line="240" w:lineRule="auto"/>
+            </w:pPr>
+            <w:r>
+              <w:rPr>
+                <w:rFonts w:ascii="Calibri" w:hAnsi="Calibri"/>
+                <w:color w:val="263238"/>
+                <w:sz w:val="17"/>
+              </w:rPr>
+              <w:t>ShadowWalletReconstructed</w:t>
+            </w:r>
+          </w:p>
+        </w:tc>
+        <w:tc>
+          <w:tcPr>
+            <w:tcW w:type="dxa" w:w="3445"/>
+            <w:vAlign w:val="center"/>
+            <w:tcMar>
+              <w:top w:w="80" w:type="dxa"/>
+              <w:start w:w="120" w:type="dxa"/>
+              <w:bottom w:w="80" w:type="dxa"/>
+              <w:end w:w="120" w:type="dxa"/>
+            </w:tcMar>
+          </w:tcPr>
+          <w:p>
+            <w:pPr>
+              <w:spacing w:after="0" w:line="240" w:lineRule="auto"/>
+            </w:pPr>
+            <w:r>
+              <w:rPr>
+                <w:rFonts w:ascii="Calibri" w:hAnsi="Calibri"/>
+                <w:color w:val="263238"/>
+                <w:sz w:val="17"/>
+              </w:rPr>
+              <w:t>A point-in-time reconstruction completes validation</w:t>
+            </w:r>
+          </w:p>
+        </w:tc>
+        <w:tc>
+          <w:tcPr>
+            <w:tcW w:type="dxa" w:w="3515"/>
+            <w:vAlign w:val="center"/>
+            <w:tcMar>
+              <w:top w:w="80" w:type="dxa"/>
+              <w:start w:w="120" w:type="dxa"/>
+              <w:bottom w:w="80" w:type="dxa"/>
+              <w:end w:w="120" w:type="dxa"/>
+            </w:tcMar>
+          </w:tcPr>
+          <w:p>
+            <w:pPr>
+              <w:spacing w:after="0" w:line="240" w:lineRule="auto"/>
+            </w:pPr>
+            <w:r>
+              <w:rPr>
+                <w:rFonts w:ascii="Calibri" w:hAnsi="Calibri"/>
+                <w:color w:val="263238"/>
+                <w:sz w:val="17"/>
+              </w:rPr>
+              <w:t>Persists reconstruction lineage and mass-balance diagnostics</w:t>
+            </w:r>
+          </w:p>
+        </w:tc>
+      </w:tr>
+      <w:tr>
+        <w:tc>
+          <w:tcPr>
+            <w:tcW w:type="dxa" w:w="2400"/>
+            <w:vAlign w:val="center"/>
+            <w:tcMar>
+              <w:top w:w="80" w:type="dxa"/>
+              <w:start w:w="120" w:type="dxa"/>
+              <w:bottom w:w="80" w:type="dxa"/>
+              <w:end w:w="120" w:type="dxa"/>
+            </w:tcMar>
+          </w:tcPr>
+          <w:p>
+            <w:pPr>
+              <w:spacing w:after="0" w:line="240" w:lineRule="auto"/>
+            </w:pPr>
+            <w:r>
+              <w:rPr>
+                <w:rFonts w:ascii="Calibri" w:hAnsi="Calibri"/>
+                <w:color w:val="263238"/>
+                <w:sz w:val="17"/>
+              </w:rPr>
+              <w:t>LeakageSignalPublished</w:t>
+            </w:r>
+          </w:p>
+        </w:tc>
+        <w:tc>
+          <w:tcPr>
+            <w:tcW w:type="dxa" w:w="3445"/>
+            <w:vAlign w:val="center"/>
+            <w:tcMar>
+              <w:top w:w="80" w:type="dxa"/>
+              <w:start w:w="120" w:type="dxa"/>
+              <w:bottom w:w="80" w:type="dxa"/>
+              <w:end w:w="120" w:type="dxa"/>
+            </w:tcMar>
+          </w:tcPr>
+          <w:p>
+            <w:pPr>
+              <w:spacing w:after="0" w:line="240" w:lineRule="auto"/>
+            </w:pPr>
+            <w:r>
+              <w:rPr>
+                <w:rFonts w:ascii="Calibri" w:hAnsi="Calibri"/>
+                <w:color w:val="263238"/>
+                <w:sz w:val="17"/>
+              </w:rPr>
+              <w:t>A governed change/leakage signal becomes available</w:t>
+            </w:r>
+          </w:p>
+        </w:tc>
+        <w:tc>
+          <w:tcPr>
+            <w:tcW w:type="dxa" w:w="3515"/>
+            <w:vAlign w:val="center"/>
+            <w:tcMar>
+              <w:top w:w="80" w:type="dxa"/>
+              <w:start w:w="120" w:type="dxa"/>
+              <w:bottom w:w="80" w:type="dxa"/>
+              <w:end w:w="120" w:type="dxa"/>
+            </w:tcMar>
+          </w:tcPr>
+          <w:p>
+            <w:pPr>
+              <w:spacing w:after="0" w:line="240" w:lineRule="auto"/>
+            </w:pPr>
+            <w:r>
+              <w:rPr>
+                <w:rFonts w:ascii="Calibri" w:hAnsi="Calibri"/>
+                <w:color w:val="263238"/>
+                <w:sz w:val="17"/>
+              </w:rPr>
+              <w:t>Separates modelled warning publication from confirmed lost flow</w:t>
+            </w:r>
+          </w:p>
+        </w:tc>
+      </w:tr>
+      <w:tr>
+        <w:tc>
+          <w:tcPr>
+            <w:tcW w:type="dxa" w:w="2400"/>
+            <w:vAlign w:val="center"/>
+            <w:tcMar>
+              <w:top w:w="80" w:type="dxa"/>
+              <w:start w:w="120" w:type="dxa"/>
+              <w:bottom w:w="80" w:type="dxa"/>
+              <w:end w:w="120" w:type="dxa"/>
+            </w:tcMar>
+          </w:tcPr>
+          <w:p>
+            <w:pPr>
+              <w:spacing w:after="0" w:line="240" w:lineRule="auto"/>
+            </w:pPr>
+            <w:r>
+              <w:rPr>
+                <w:rFonts w:ascii="Calibri" w:hAnsi="Calibri"/>
+                <w:color w:val="263238"/>
+                <w:sz w:val="17"/>
+              </w:rPr>
+              <w:t>ActionPortfolioSelected</w:t>
+            </w:r>
+          </w:p>
+        </w:tc>
+        <w:tc>
+          <w:tcPr>
+            <w:tcW w:type="dxa" w:w="3445"/>
+            <w:vAlign w:val="center"/>
+            <w:tcMar>
+              <w:top w:w="80" w:type="dxa"/>
+              <w:start w:w="120" w:type="dxa"/>
+              <w:bottom w:w="80" w:type="dxa"/>
+              <w:end w:w="120" w:type="dxa"/>
+            </w:tcMar>
+          </w:tcPr>
+          <w:p>
+            <w:pPr>
+              <w:spacing w:after="0" w:line="240" w:lineRule="auto"/>
+            </w:pPr>
+            <w:r>
+              <w:rPr>
+                <w:rFonts w:ascii="Calibri" w:hAnsi="Calibri"/>
+                <w:color w:val="263238"/>
+                <w:sz w:val="17"/>
+              </w:rPr>
+              <w:t>The constrained scenario portfolio is selected</w:t>
+            </w:r>
+          </w:p>
+        </w:tc>
+        <w:tc>
+          <w:tcPr>
+            <w:tcW w:type="dxa" w:w="3515"/>
+            <w:vAlign w:val="center"/>
+            <w:tcMar>
+              <w:top w:w="80" w:type="dxa"/>
+              <w:start w:w="120" w:type="dxa"/>
+              <w:bottom w:w="80" w:type="dxa"/>
+              <w:end w:w="120" w:type="dxa"/>
+            </w:tcMar>
+          </w:tcPr>
+          <w:p>
+            <w:pPr>
+              <w:spacing w:after="0" w:line="240" w:lineRule="auto"/>
+            </w:pPr>
+            <w:r>
+              <w:rPr>
+                <w:rFonts w:ascii="Calibri" w:hAnsi="Calibri"/>
+                <w:color w:val="263238"/>
+                <w:sz w:val="17"/>
+              </w:rPr>
+              <w:t>Preserves scenarios, constraints, policy and selection denominator</w:t>
+            </w:r>
+          </w:p>
+        </w:tc>
+      </w:tr>
+      <w:tr>
+        <w:tc>
+          <w:tcPr>
+            <w:tcW w:type="dxa" w:w="2400"/>
+            <w:vAlign w:val="center"/>
+            <w:tcMar>
+              <w:top w:w="80" w:type="dxa"/>
+              <w:start w:w="120" w:type="dxa"/>
+              <w:bottom w:w="80" w:type="dxa"/>
+              <w:end w:w="120" w:type="dxa"/>
+            </w:tcMar>
+          </w:tcPr>
+          <w:p>
+            <w:pPr>
+              <w:spacing w:after="0" w:line="240" w:lineRule="auto"/>
+            </w:pPr>
+            <w:r>
+              <w:rPr>
+                <w:rFonts w:ascii="Calibri" w:hAnsi="Calibri"/>
+                <w:color w:val="263238"/>
+                <w:sz w:val="17"/>
+              </w:rPr>
+              <w:t>EvidenceAcquisitionApproved</w:t>
+            </w:r>
+          </w:p>
+        </w:tc>
+        <w:tc>
+          <w:tcPr>
+            <w:tcW w:type="dxa" w:w="3445"/>
+            <w:vAlign w:val="center"/>
+            <w:tcMar>
+              <w:top w:w="80" w:type="dxa"/>
+              <w:start w:w="120" w:type="dxa"/>
+              <w:bottom w:w="80" w:type="dxa"/>
+              <w:end w:w="120" w:type="dxa"/>
+            </w:tcMar>
+          </w:tcPr>
+          <w:p>
+            <w:pPr>
+              <w:spacing w:after="0" w:line="240" w:lineRule="auto"/>
+            </w:pPr>
+            <w:r>
+              <w:rPr>
+                <w:rFonts w:ascii="Calibri" w:hAnsi="Calibri"/>
+                <w:color w:val="263238"/>
+                <w:sz w:val="17"/>
+              </w:rPr>
+              <w:t>A data owner approves or rejects a VOI candidate</w:t>
+            </w:r>
+          </w:p>
+        </w:tc>
+        <w:tc>
+          <w:tcPr>
+            <w:tcW w:type="dxa" w:w="3515"/>
+            <w:vAlign w:val="center"/>
+            <w:tcMar>
+              <w:top w:w="80" w:type="dxa"/>
+              <w:start w:w="120" w:type="dxa"/>
+              <w:bottom w:w="80" w:type="dxa"/>
+              <w:end w:w="120" w:type="dxa"/>
+            </w:tcMar>
+          </w:tcPr>
+          <w:p>
+            <w:pPr>
+              <w:spacing w:after="0" w:line="240" w:lineRule="auto"/>
+            </w:pPr>
+            <w:r>
+              <w:rPr>
+                <w:rFonts w:ascii="Calibri" w:hAnsi="Calibri"/>
+                <w:color w:val="263238"/>
+                <w:sz w:val="17"/>
+              </w:rPr>
+              <w:t>Audits non-autonomous evidence work and approval authority</w:t>
+            </w:r>
+          </w:p>
+        </w:tc>
+      </w:tr>
+      <w:tr>
+        <w:tc>
+          <w:tcPr>
+            <w:tcW w:type="dxa" w:w="2400"/>
+            <w:vAlign w:val="center"/>
+            <w:tcMar>
+              <w:top w:w="80" w:type="dxa"/>
+              <w:start w:w="120" w:type="dxa"/>
+              <w:bottom w:w="80" w:type="dxa"/>
+              <w:end w:w="120" w:type="dxa"/>
+            </w:tcMar>
+          </w:tcPr>
+          <w:p>
+            <w:pPr>
+              <w:spacing w:after="0" w:line="240" w:lineRule="auto"/>
+            </w:pPr>
+            <w:r>
+              <w:rPr>
+                <w:rFonts w:ascii="Calibri" w:hAnsi="Calibri"/>
+                <w:color w:val="263238"/>
+                <w:sz w:val="17"/>
+              </w:rPr>
+              <w:t>DecisionBriefCompiled</w:t>
+            </w:r>
+          </w:p>
+        </w:tc>
+        <w:tc>
+          <w:tcPr>
+            <w:tcW w:type="dxa" w:w="3445"/>
+            <w:vAlign w:val="center"/>
+            <w:tcMar>
+              <w:top w:w="80" w:type="dxa"/>
+              <w:start w:w="120" w:type="dxa"/>
+              <w:bottom w:w="80" w:type="dxa"/>
+              <w:end w:w="120" w:type="dxa"/>
+            </w:tcMar>
+          </w:tcPr>
+          <w:p>
+            <w:pPr>
+              <w:spacing w:after="0" w:line="240" w:lineRule="auto"/>
+            </w:pPr>
+            <w:r>
+              <w:rPr>
+                <w:rFonts w:ascii="Calibri" w:hAnsi="Calibri"/>
+                <w:color w:val="263238"/>
+                <w:sz w:val="17"/>
+              </w:rPr>
+              <w:t>A closed claim pack is compiled or falls back</w:t>
+            </w:r>
+          </w:p>
+        </w:tc>
+        <w:tc>
+          <w:tcPr>
+            <w:tcW w:type="dxa" w:w="3515"/>
+            <w:vAlign w:val="center"/>
+            <w:tcMar>
+              <w:top w:w="80" w:type="dxa"/>
+              <w:start w:w="120" w:type="dxa"/>
+              <w:bottom w:w="80" w:type="dxa"/>
+              <w:end w:w="120" w:type="dxa"/>
+            </w:tcMar>
+          </w:tcPr>
+          <w:p>
+            <w:pPr>
+              <w:spacing w:after="0" w:line="240" w:lineRule="auto"/>
+            </w:pPr>
+            <w:r>
+              <w:rPr>
+                <w:rFonts w:ascii="Calibri" w:hAnsi="Calibri"/>
+                <w:color w:val="263238"/>
+                <w:sz w:val="17"/>
+              </w:rPr>
+              <w:t>Records evidence pack, template, provider mode and validator result</w:t>
             </w:r>
           </w:p>
         </w:tc>
@@ -27405,7 +27878,7 @@
                 <w:color w:val="263238"/>
                 <w:sz w:val="17"/>
               </w:rPr>
-              <w:t>outputs/v3_validation/</w:t>
+              <w:t>outputs/v3/</w:t>
             </w:r>
           </w:p>
         </w:tc>
@@ -27430,7 +27903,7 @@
                 <w:color w:val="263238"/>
                 <w:sz w:val="17"/>
               </w:rPr>
-              <w:t>V3 decision-lab fixture, validation report, anonymous-flow, temporal, portfolio and VOI outputs</w:t>
+              <w:t>Canonical V3 Decision Lab snapshot, validation projection and selected-action briefs</w:t>
             </w:r>
           </w:p>
         </w:tc>
@@ -27457,7 +27930,7 @@
                 <w:color w:val="263238"/>
                 <w:sz w:val="17"/>
               </w:rPr>
-              <w:t>outputs/client_demo/</w:t>
+              <w:t>outputs/v3_validation/</w:t>
             </w:r>
           </w:p>
         </w:tc>
@@ -27482,7 +27955,7 @@
                 <w:color w:val="263238"/>
                 <w:sz w:val="17"/>
               </w:rPr>
-              <w:t>Demonstration snapshot, scorecard, manifests and generated interface inputs</w:t>
+              <w:t>V3 mechanical validation report and detailed anonymous-flow, temporal, portfolio and VOI diagnostics</w:t>
             </w:r>
           </w:p>
         </w:tc>
@@ -27509,7 +27982,7 @@
                 <w:color w:val="263238"/>
                 <w:sz w:val="17"/>
               </w:rPr>
-              <w:t>legacy/</w:t>
+              <w:t>outputs/client_demo/</w:t>
             </w:r>
           </w:p>
         </w:tc>
@@ -27534,7 +28007,59 @@
                 <w:color w:val="263238"/>
                 <w:sz w:val="17"/>
               </w:rPr>
-              <w:t>Frozen V1 runtime/fixture boundary where retained</w:t>
+              <w:t>Demonstration snapshot, scorecard, manifests and generated interface inputs</w:t>
+            </w:r>
+          </w:p>
+        </w:tc>
+      </w:tr>
+      <w:tr>
+        <w:tc>
+          <w:tcPr>
+            <w:tcW w:type="dxa" w:w="2782"/>
+            <w:vAlign w:val="center"/>
+            <w:tcMar>
+              <w:top w:w="80" w:type="dxa"/>
+              <w:start w:w="120" w:type="dxa"/>
+              <w:bottom w:w="80" w:type="dxa"/>
+              <w:end w:w="120" w:type="dxa"/>
+            </w:tcMar>
+          </w:tcPr>
+          <w:p>
+            <w:pPr>
+              <w:spacing w:after="0" w:line="240" w:lineRule="auto"/>
+            </w:pPr>
+            <w:r>
+              <w:rPr>
+                <w:rFonts w:ascii="Calibri" w:hAnsi="Calibri"/>
+                <w:color w:val="263238"/>
+                <w:sz w:val="17"/>
+              </w:rPr>
+              <w:t>legacy/v1/</w:t>
+            </w:r>
+          </w:p>
+        </w:tc>
+        <w:tc>
+          <w:tcPr>
+            <w:tcW w:type="dxa" w:w="6578"/>
+            <w:vAlign w:val="center"/>
+            <w:tcMar>
+              <w:top w:w="80" w:type="dxa"/>
+              <w:start w:w="120" w:type="dxa"/>
+              <w:bottom w:w="80" w:type="dxa"/>
+              <w:end w:w="120" w:type="dxa"/>
+            </w:tcMar>
+          </w:tcPr>
+          <w:p>
+            <w:pPr>
+              <w:spacing w:after="0" w:line="240" w:lineRule="auto"/>
+            </w:pPr>
+            <w:r>
+              <w:rPr>
+                <w:rFonts w:ascii="Calibri" w:hAnsi="Calibri"/>
+                <w:color w:val="263238"/>
+                <w:sz w:val="17"/>
+              </w:rPr>
+              <w:t>Frozen V1 assumptions, fixtures and outputs used only as regression boundaries</w:t>
             </w:r>
           </w:p>
         </w:tc>

</xml_diff>